<commit_message>
Update guidelines and UI components, exclude experimental divergence feature
</commit_message>
<xml_diff>
--- a/manual/04_Concordance.docx
+++ b/manual/04_Concordance.docx
@@ -829,6 +829,58 @@
       </w:pPr>
       <w:r>
         <w:t>Use the dropdown menu to view definitions and random corpus examples for Part-of-Speech (POS) tags, as well as other annotations you might have added from the Overview module (such as Named Entity Recognition (NER), Dependency Parsing, or Sentiment Analysis).</w:t>
+      </w:r>
+    </w:p>
+    <w:p>
+      <w:pPr>
+        <w:pStyle w:val="Heading2"/>
+      </w:pPr>
+      <w:r>
+        <w:t>9. Working with .eaf Corpora (Glossing Style)</w:t>
+      </w:r>
+    </w:p>
+    <w:p>
+      <w:r>
+        <w:t>When dealing with corpora imported from .eaf (ELAN) files, you can display the concordance lines in a glossing style. Follow these steps:</w:t>
+      </w:r>
+    </w:p>
+    <w:p>
+      <w:r>
+        <w:t>1. Choose sentence display: Ensure that your display mode is set to show sentences.</w:t>
+      </w:r>
+    </w:p>
+    <w:p>
+      <w:r>
+        <w:t>2. Set up annotation tier: Configure the tiers so that the annotations match your imported structure.</w:t>
+      </w:r>
+    </w:p>
+    <w:p>
+      <w:r>
+        <w:t>3. Sentence-level translation: Make sure that the translation tier is aligned at the sentence level.</w:t>
+      </w:r>
+    </w:p>
+    <w:p>
+      <w:r>
+        <w:t>4. Word-level alignment: Other tiers (such as gloss or POS) are ideally aligned at the word level.</w:t>
+      </w:r>
+    </w:p>
+    <w:p>
+      <w:r>
+        <w:t>5. Searching attributes: To search within specific tiers, use the syntax &lt;attribute="value"&gt;.</w:t>
+      </w:r>
+    </w:p>
+    <w:p>
+      <w:r>
+        <w:t>For example, if the attribute for your gloss tier is 'gloss' and you want to search for a value 'ACT', type:</w:t>
+        <w:br/>
+        <w:t>&lt;gloss="ACT"&gt;</w:t>
+      </w:r>
+    </w:p>
+    <w:p>
+      <w:r>
+        <w:t>If you are in doubt about the exact position or want a partial match, use regex:</w:t>
+        <w:br/>
+        <w:t>&lt;gloss=".*ACT.*"&gt;</w:t>
       </w:r>
     </w:p>
     <w:sectPr>

</xml_diff>